<commit_message>
Add Grafana Kubernetes deployment and update documentation
- Add k8s/grafana-deployment.yaml with ConfigMaps (datasource, dashboard provider, dashboard JSON), Deployment, and NodePort Service
- Update README.md: project structure, k8s deploy steps, manifest details, monitoring section
- Update Heart_Disease_MLOps_Report.md: sections 10.2-10.4, pipeline flow
- Regenerate Heart_Disease_MLOps_Report.docx
</commit_message>
<xml_diff>
--- a/Documentation/Heart_Disease_MLOps_Report.docx
+++ b/Documentation/Heart_Disease_MLOps_Report.docx
@@ -3757,7 +3757,7 @@
         <w:jc w:val="center"/>
       </w:pPr>
       <w:r>
-        <w:t>Deploy Prometheus on Kubernetes</w:t>
+        <w:t>Deploy Prometheus and Grafana on Kubernetes</w:t>
       </w:r>
     </w:p>
     <w:p>
@@ -3772,7 +3772,17 @@
     </w:p>
     <w:p>
       <w:r>
+        <w:t>kubectl apply -f k8s/grafana-deployment.yaml</w:t>
+      </w:r>
+    </w:p>
+    <w:p>
+      <w:r>
         <w:t>minikube service prometheus-service</w:t>
+      </w:r>
+    </w:p>
+    <w:p>
+      <w:r>
+        <w:t>minikube service grafana-service</w:t>
       </w:r>
     </w:p>
     <w:p>
@@ -3802,7 +3812,36 @@
         <w:t>- Average prediction latency over time</w:t>
         <w:br/>
         <w:br/>
-        <w:t>**Grafana access:** http://localhost:3000 (Credentials: admin / admin)</w:t>
+        <w:t>**Docker Compose:** http://localhost:3000 (Credentials: admin / admin)</w:t>
+        <w:br/>
+        <w:br/>
+        <w:t>**Kubernetes:** `minikube service grafana-service` (Credentials: admin / admin)</w:t>
+        <w:br/>
+        <w:br/>
+        <w:t>### 10.4 Kubernetes Monitoring Stack</w:t>
+        <w:br/>
+        <w:br/>
+        <w:t>The full monitoring stack (Prometheus + Grafana) is deployable on Kubernetes via dedicated manifests in `k8s/`:</w:t>
+        <w:br/>
+        <w:br/>
+        <w:t>| Manifest | Description |</w:t>
+        <w:br/>
+        <w:t>|----------|-------------|</w:t>
+        <w:br/>
+        <w:t>| `k8s/prometheus-config.yaml` | ConfigMap with Prometheus scrape config targeting `heart-disease-api-service:80` |</w:t>
+        <w:br/>
+        <w:t>| `k8s/prometheus-deployment.yaml` | Prometheus Deployment + NodePort Service (port 9090) |</w:t>
+        <w:br/>
+        <w:t>| `k8s/grafana-deployment.yaml` | Grafana Deployment + NodePort Service (port 3000) with ConfigMaps for datasource, dashboard provider, and dashboard JSON |</w:t>
+        <w:br/>
+        <w:br/>
+        <w:t>Grafana on Kubernetes is pre-configured with:</w:t>
+        <w:br/>
+        <w:t>- **Datasource:** Prometheus at `http://prometheus-service:9090` (K8s service DNS)</w:t>
+        <w:br/>
+        <w:t>- **Dashboard:** "Heart Disease API Monitoring" auto-provisioned from ConfigMap</w:t>
+        <w:br/>
+        <w:t>- **Environment:** admin/admin credentials, sign-up disabled</w:t>
         <w:br/>
         <w:br/>
         <w:t>---</w:t>

</xml_diff>